<commit_message>
updated meeting report 2
</commit_message>
<xml_diff>
--- a/Meeting Reports/Group Meeting Report Iteration Two.docx
+++ b/Meeting Reports/Group Meeting Report Iteration Two.docx
@@ -1040,9 +1040,9 @@
                 <w:rFonts w:asciiTheme="minorHAnsi" w:hAnsiTheme="minorHAnsi" w:cstheme="minorHAnsi"/>
               </w:rPr>
             </w:pPr>
-            <w:bookmarkStart w:id="0" w:name="MinuteItems"/>
-            <w:bookmarkStart w:id="1" w:name="MinuteTopicSection"/>
-            <w:bookmarkEnd w:id="0"/>
+            <w:bookmarkStart w:id="0" w:name="MinuteTopicSection"/>
+            <w:bookmarkStart w:id="1" w:name="MinuteItems"/>
+            <w:bookmarkEnd w:id="1"/>
             <w:r>
               <w:rPr>
                 <w:rFonts w:asciiTheme="minorHAnsi" w:hAnsiTheme="minorHAnsi" w:cstheme="minorHAnsi"/>
@@ -1224,7 +1224,13 @@
         <w:rPr>
           <w:rFonts w:cstheme="minorHAnsi"/>
         </w:rPr>
-        <w:t>responsibly</w:t>
+        <w:t>responsibilit</w:t>
+      </w:r>
+      <w:r>
+        <w:rPr>
+          <w:rFonts w:cstheme="minorHAnsi"/>
+        </w:rPr>
+        <w:t>y</w:t>
       </w:r>
       <w:r>
         <w:rPr>
@@ -1543,7 +1549,19 @@
               <w:rPr>
                 <w:rFonts w:cstheme="minorHAnsi"/>
               </w:rPr>
-              <w:t>Begin Gantt chert</w:t>
+              <w:t>Begin Gantt ch</w:t>
+            </w:r>
+            <w:r>
+              <w:rPr>
+                <w:rFonts w:cstheme="minorHAnsi"/>
+              </w:rPr>
+              <w:t>a</w:t>
+            </w:r>
+            <w:r>
+              <w:rPr>
+                <w:rFonts w:cstheme="minorHAnsi"/>
+              </w:rPr>
+              <w:t>rt</w:t>
             </w:r>
           </w:p>
         </w:tc>
@@ -1771,7 +1789,7 @@
           <w:tcPr>
             <w:tcW w:w="1620" w:type="dxa"/>
           </w:tcPr>
-          <w:bookmarkEnd w:id="1"/>
+          <w:bookmarkEnd w:id="0"/>
           <w:p>
             <w:pPr>
               <w:pStyle w:val="Heading2"/>
@@ -1913,6 +1931,44 @@
           <w:rFonts w:cstheme="minorHAnsi"/>
         </w:rPr>
         <w:t xml:space="preserve"> chart. A draft version was later uploaded to GitHub as a starting point.</w:t>
+      </w:r>
+      <w:r>
+        <w:rPr>
+          <w:rFonts w:cstheme="minorHAnsi"/>
+        </w:rPr>
+        <w:t xml:space="preserve"> The group identified delays in completing the G</w:t>
+      </w:r>
+      <w:r>
+        <w:rPr>
+          <w:rFonts w:cstheme="minorHAnsi"/>
+        </w:rPr>
+        <w:t>an</w:t>
+      </w:r>
+      <w:r>
+        <w:rPr>
+          <w:rFonts w:cstheme="minorHAnsi"/>
+        </w:rPr>
+        <w:t xml:space="preserve">tt chart due to uncertainty about task sequencing. To address this the group </w:t>
+      </w:r>
+      <w:r>
+        <w:rPr>
+          <w:rFonts w:cstheme="minorHAnsi"/>
+        </w:rPr>
+        <w:t xml:space="preserve">agreed to </w:t>
+      </w:r>
+      <w:proofErr w:type="gramStart"/>
+      <w:r>
+        <w:rPr>
+          <w:rFonts w:cstheme="minorHAnsi"/>
+        </w:rPr>
+        <w:t>assist</w:t>
+      </w:r>
+      <w:proofErr w:type="gramEnd"/>
+      <w:r>
+        <w:rPr>
+          <w:rFonts w:cstheme="minorHAnsi"/>
+        </w:rPr>
+        <w:t xml:space="preserve"> more help in refining the task.</w:t>
       </w:r>
     </w:p>
     <w:p>
@@ -2693,21 +2749,7 @@
               <w:rPr>
                 <w:rFonts w:cstheme="minorHAnsi"/>
               </w:rPr>
-              <w:t xml:space="preserve">Review updated </w:t>
-            </w:r>
-            <w:proofErr w:type="gramStart"/>
-            <w:r>
-              <w:rPr>
-                <w:rFonts w:cstheme="minorHAnsi"/>
-              </w:rPr>
-              <w:t>stake holder</w:t>
-            </w:r>
-            <w:proofErr w:type="gramEnd"/>
-            <w:r>
-              <w:rPr>
-                <w:rFonts w:cstheme="minorHAnsi"/>
-              </w:rPr>
-              <w:t xml:space="preserve"> register</w:t>
+              <w:t>Review updated stakeholder register</w:t>
             </w:r>
           </w:p>
         </w:tc>
@@ -3090,21 +3132,7 @@
         <w:rPr>
           <w:rFonts w:cstheme="minorHAnsi"/>
         </w:rPr>
-        <w:t xml:space="preserve">Resources need to be </w:t>
-      </w:r>
-      <w:proofErr w:type="gramStart"/>
-      <w:r>
-        <w:rPr>
-          <w:rFonts w:cstheme="minorHAnsi"/>
-        </w:rPr>
-        <w:t>documented</w:t>
-      </w:r>
-      <w:proofErr w:type="gramEnd"/>
-      <w:r>
-        <w:rPr>
-          <w:rFonts w:cstheme="minorHAnsi"/>
-        </w:rPr>
-        <w:t xml:space="preserve"> and GitHub must be kept updated and reviewed.</w:t>
+        <w:t>The team agreed to maintain weekly GitHub updates and complete the resource requirement list before the next iteration to improve coordination.</w:t>
       </w:r>
     </w:p>
     <w:tbl>
@@ -3302,7 +3330,7 @@
               <w:rPr>
                 <w:rFonts w:cstheme="minorHAnsi"/>
               </w:rPr>
-              <w:t>16 Aprill</w:t>
+              <w:t>16 April</w:t>
             </w:r>
           </w:p>
         </w:tc>
@@ -3324,7 +3352,6 @@
               <w:rPr>
                 <w:rFonts w:cstheme="minorHAnsi"/>
               </w:rPr>
-              <w:lastRenderedPageBreak/>
               <w:t>Update README and repository</w:t>
             </w:r>
           </w:p>
@@ -3388,7 +3415,13 @@
               <w:rPr>
                 <w:rFonts w:cstheme="minorHAnsi"/>
               </w:rPr>
-              <w:t>Test files and fix issues</w:t>
+              <w:t xml:space="preserve">Test </w:t>
+            </w:r>
+            <w:r>
+              <w:rPr>
+                <w:rFonts w:cstheme="minorHAnsi"/>
+              </w:rPr>
+              <w:t>all uploaded files on GitHub Pages and resolve broken links before submission.</w:t>
             </w:r>
           </w:p>
         </w:tc>
@@ -4748,7 +4781,6 @@
   <w:style w:type="character" w:default="1" w:styleId="DefaultParagraphFont">
     <w:name w:val="Default Paragraph Font"/>
     <w:uiPriority w:val="1"/>
-    <w:semiHidden/>
     <w:unhideWhenUsed/>
   </w:style>
   <w:style w:type="table" w:default="1" w:styleId="TableNormal">
@@ -6098,8 +6130,11 @@
     <w:rsid w:val="00441576"/>
     <w:rsid w:val="00444E4C"/>
     <w:rsid w:val="00515850"/>
+    <w:rsid w:val="007D0D7D"/>
     <w:rsid w:val="00876526"/>
     <w:rsid w:val="009F4E06"/>
+    <w:rsid w:val="00BC0C37"/>
+    <w:rsid w:val="00BC1280"/>
     <w:rsid w:val="00C926F6"/>
     <w:rsid w:val="00EC590A"/>
     <w:rsid w:val="00FD3709"/>
@@ -6718,6 +6753,20 @@
       <w14:ligatures w14:val="standardContextual"/>
     </w:rPr>
   </w:style>
+  <w:style w:type="paragraph" w:customStyle="1" w:styleId="558D31515F554BC687B4674ECB89AE11">
+    <w:name w:val="558D31515F554BC687B4674ECB89AE11"/>
+    <w:rsid w:val="00BC1280"/>
+    <w:pPr>
+      <w:spacing w:line="278" w:lineRule="auto"/>
+    </w:pPr>
+    <w:rPr>
+      <w:kern w:val="2"/>
+      <w:sz w:val="24"/>
+      <w:szCs w:val="24"/>
+      <w:lang w:val="en-NZ" w:eastAsia="en-NZ"/>
+      <w14:ligatures w14:val="standardContextual"/>
+    </w:rPr>
+  </w:style>
 </w:styles>
 </file>
 
@@ -7012,18 +7061,18 @@
 </file>
 
 <file path=customXml/item1.xml><?xml version="1.0" encoding="utf-8"?>
+<p:properties xmlns:p="http://schemas.microsoft.com/office/2006/metadata/properties" xmlns:xsi="http://www.w3.org/2001/XMLSchema-instance" xmlns:pc="http://schemas.microsoft.com/office/infopath/2007/PartnerControls">
+  <documentManagement/>
+</p:properties>
+</file>
+
+<file path=customXml/item2.xml><?xml version="1.0" encoding="utf-8"?>
 <?mso-contentType ?>
 <FormTemplates xmlns="http://schemas.microsoft.com/sharepoint/v3/contenttype/forms">
   <Display>DocumentLibraryForm</Display>
   <Edit>DocumentLibraryForm</Edit>
   <New>DocumentLibraryForm</New>
 </FormTemplates>
-</file>
-
-<file path=customXml/item2.xml><?xml version="1.0" encoding="utf-8"?>
-<p:properties xmlns:p="http://schemas.microsoft.com/office/2006/metadata/properties" xmlns:xsi="http://www.w3.org/2001/XMLSchema-instance" xmlns:pc="http://schemas.microsoft.com/office/infopath/2007/PartnerControls">
-  <documentManagement/>
-</p:properties>
 </file>
 
 <file path=customXml/item3.xml><?xml version="1.0" encoding="utf-8"?>
@@ -7198,18 +7247,18 @@
 </file>
 
 <file path=customXml/itemProps1.xml><?xml version="1.0" encoding="utf-8"?>
-<ds:datastoreItem xmlns:ds="http://schemas.openxmlformats.org/officeDocument/2006/customXml" ds:itemID="{5542552F-FBC5-443F-B977-388D14297FB7}">
+<ds:datastoreItem xmlns:ds="http://schemas.openxmlformats.org/officeDocument/2006/customXml" ds:itemID="{5A86B5EA-CD6A-44AC-ADB2-4CA45AFB352E}">
   <ds:schemaRefs>
-    <ds:schemaRef ds:uri="http://schemas.microsoft.com/sharepoint/v3/contenttype/forms"/>
+    <ds:schemaRef ds:uri="http://schemas.microsoft.com/office/2006/metadata/properties"/>
+    <ds:schemaRef ds:uri="http://schemas.microsoft.com/office/infopath/2007/PartnerControls"/>
   </ds:schemaRefs>
 </ds:datastoreItem>
 </file>
 
 <file path=customXml/itemProps2.xml><?xml version="1.0" encoding="utf-8"?>
-<ds:datastoreItem xmlns:ds="http://schemas.openxmlformats.org/officeDocument/2006/customXml" ds:itemID="{5A86B5EA-CD6A-44AC-ADB2-4CA45AFB352E}">
+<ds:datastoreItem xmlns:ds="http://schemas.openxmlformats.org/officeDocument/2006/customXml" ds:itemID="{5542552F-FBC5-443F-B977-388D14297FB7}">
   <ds:schemaRefs>
-    <ds:schemaRef ds:uri="http://schemas.microsoft.com/office/2006/metadata/properties"/>
-    <ds:schemaRef ds:uri="http://schemas.microsoft.com/office/infopath/2007/PartnerControls"/>
+    <ds:schemaRef ds:uri="http://schemas.microsoft.com/sharepoint/v3/contenttype/forms"/>
   </ds:schemaRefs>
 </ds:datastoreItem>
 </file>

</xml_diff>